<commit_message>
önallo munka atirasi kezdése
</commit_message>
<xml_diff>
--- a/Egészséges életmódot támogató webalkalmazás fejlesztése ASP.NET MVC és Angular alapokon old.docx
+++ b/Egészséges életmódot támogató webalkalmazás fejlesztése ASP.NET MVC és Angular alapokon old.docx
@@ -504,14 +504,24 @@
       <w:pPr>
         <w:pStyle w:val="Cmlapkarstanszk"/>
       </w:pPr>
-      <w:fldSimple w:instr=" DOCPROPERTY  Company  \* MERGEFORMAT ">
-        <w:r>
-          <w:t xml:space="preserve">Automatizálási és Alkalmazott Informatikai Tanszék </w:t>
-        </w:r>
-        <w:r>
-          <w:t>Tanszék</w:t>
-        </w:r>
-      </w:fldSimple>
+      <w:r>
+        <w:fldChar w:fldCharType="begin"/>
+      </w:r>
+      <w:r>
+        <w:instrText xml:space="preserve"> DOCPROPERTY  Company  \* MERGEFORMAT </w:instrText>
+      </w:r>
+      <w:r>
+        <w:fldChar w:fldCharType="separate"/>
+      </w:r>
+      <w:r>
+        <w:t xml:space="preserve">Automatizálási és Alkalmazott Informatikai Tanszék </w:t>
+      </w:r>
+      <w:r>
+        <w:t>Tanszék</w:t>
+      </w:r>
+      <w:r>
+        <w:fldChar w:fldCharType="end"/>
+      </w:r>
     </w:p>
     <w:p/>
     <w:p/>
@@ -3772,6 +3782,7 @@
         <w:pStyle w:val="Nyilatkozatcm"/>
       </w:pPr>
       <w:r>
+        <w:lastRenderedPageBreak/>
         <w:t>Hallgatói nyilatkozat</w:t>
       </w:r>
     </w:p>
@@ -3868,7 +3879,7 @@
         <w:rPr>
           <w:noProof/>
         </w:rPr>
-        <w:t>2025. 11. 16.</w:t>
+        <w:t>2025. 11. 29.</w:t>
       </w:r>
       <w:r>
         <w:fldChar w:fldCharType="end"/>
@@ -3924,6 +3935,7 @@
       </w:pPr>
       <w:bookmarkStart w:id="0" w:name="_Toc209525197"/>
       <w:r>
+        <w:lastRenderedPageBreak/>
         <w:t>Összefoglaló</w:t>
       </w:r>
       <w:bookmarkEnd w:id="0"/>
@@ -3939,6 +3951,7 @@
       </w:pPr>
       <w:bookmarkStart w:id="1" w:name="_Toc209525198"/>
       <w:r>
+        <w:lastRenderedPageBreak/>
         <w:t>Abstract</w:t>
       </w:r>
       <w:bookmarkEnd w:id="1"/>
@@ -3955,6 +3968,7 @@
       <w:bookmarkStart w:id="2" w:name="_Toc332797397"/>
       <w:bookmarkStart w:id="3" w:name="_Toc209525199"/>
       <w:r>
+        <w:lastRenderedPageBreak/>
         <w:t>Bevezetés</w:t>
       </w:r>
       <w:bookmarkEnd w:id="2"/>
@@ -4029,8 +4043,8 @@
         <w:pStyle w:val="Cmsor1"/>
       </w:pPr>
       <w:bookmarkStart w:id="6" w:name="_Toc209525202"/>
-      <w:bookmarkStart w:id="7" w:name="_GoBack"/>
-      <w:r>
+      <w:r>
+        <w:lastRenderedPageBreak/>
         <w:t>Felhasznált technológiák</w:t>
       </w:r>
       <w:bookmarkEnd w:id="6"/>
@@ -4039,39 +4053,39 @@
       <w:pPr>
         <w:pStyle w:val="Cmsor2"/>
       </w:pPr>
-      <w:bookmarkStart w:id="8" w:name="_Toc209525203"/>
+      <w:bookmarkStart w:id="7" w:name="_Toc209525203"/>
       <w:r>
         <w:t>Technikai háttér</w:t>
       </w:r>
+      <w:bookmarkEnd w:id="7"/>
+    </w:p>
+    <w:p>
+      <w:r>
+        <w:t>A webalkalmazás két fő komponensre bontható: a backendre és a frontendre. A backend ASP.NET Core technológiával készült, amely egy modern, moduláris, nyílt forráskódú keretrendszer. A frontend Angular 19 alapon működik, amely egy erős JavaScript keretrendszer, különösen előnyös egyoldalas (SPA) alkalmazások fejlesztéséhez. A backend a Microsoft SQL Server adatbázissal kommunikál az Entity Framework Core ORM révén. A rendszer RESTful API-kon keresztül biztosít kommunikációt a frontend felé, így szigorúan elválik a kliens és a szerveroldali logika. A DTO-k (Data Transfer Object) használata biztosítja, hogy a backend és a frontend közötti adattovábbítás tömör és biztonságos legyen. A frontend komponens az NSwag eszköz segítségével generált TypeScript service osztályokat használ, amelyek automatikusan illeszkednek a backend API-khoz és DTO khoz. A felhasználói felület Angular Material és Bootstrap komponenseket alkalmaz a reszponzív, esztétikus megjelenés érdekében. A felhasználókezelést az ASP.NET Identity biztosítja, kiterjesztve jelszó-visszaállítási, email-megerősítési és token-alapú hitelesítési lehetőségekkel. Az email küldést a Mailjet API segítségével valósítja meg a rendszer.</w:t>
+      </w:r>
+    </w:p>
+    <w:p/>
+    <w:p>
+      <w:pPr>
+        <w:pStyle w:val="Cmsor2"/>
+      </w:pPr>
+      <w:bookmarkStart w:id="8" w:name="_Toc209525204"/>
+      <w:r>
+        <w:t>Szerver oldali technológiák:</w:t>
+      </w:r>
       <w:bookmarkEnd w:id="8"/>
     </w:p>
     <w:p>
-      <w:r>
-        <w:t>A webalkalmazás két fő komponensre bontható: a backendre és a frontendre. A backend ASP.NET Core technológiával készült, amely egy modern, moduláris, nyílt forráskódú keretrendszer. A frontend Angular 19 alapon működik, amely egy erős JavaScript keretrendszer, különösen előnyös egyoldalas (SPA) alkalmazások fejlesztéséhez. A backend a Microsoft SQL Server adatbázissal kommunikál az Entity Framework Core ORM révén. A rendszer RESTful API-kon keresztül biztosít kommunikációt a frontend felé, így szigorúan elválik a kliens és a szerveroldali logika. A DTO-k (Data Transfer Object) használata biztosítja, hogy a backend és a frontend közötti adattovábbítás tömör és biztonságos legyen. A frontend komponens az NSwag eszköz segítségével generált TypeScript service osztályokat használ, amelyek automatikusan illeszkednek a backend API-khoz és DTO khoz. A felhasználói felület Angular Material és Bootstrap komponenseket alkalmaz a reszponzív, esztétikus megjelenés érdekében. A felhasználókezelést az ASP.NET Identity biztosítja, kiterjesztve jelszó-visszaállítási, email-megerősítési és token-alapú hitelesítési lehetőségekkel. Az email küldést a Mailjet API segítségével valósítja meg a rendszer.</w:t>
-      </w:r>
-    </w:p>
-    <w:p/>
-    <w:p>
-      <w:pPr>
-        <w:pStyle w:val="Cmsor2"/>
-      </w:pPr>
-      <w:bookmarkStart w:id="9" w:name="_Toc209525204"/>
-      <w:r>
-        <w:t>Szerver oldali technológiák:</w:t>
+      <w:pPr>
+        <w:pStyle w:val="Cmsor3"/>
+      </w:pPr>
+      <w:bookmarkStart w:id="9" w:name="_Toc209525205"/>
+      <w:r>
+        <w:t>ASP.NET Core</w:t>
       </w:r>
       <w:bookmarkEnd w:id="9"/>
     </w:p>
     <w:p>
-      <w:pPr>
-        <w:pStyle w:val="Cmsor3"/>
-      </w:pPr>
-      <w:bookmarkStart w:id="10" w:name="_Toc209525205"/>
-      <w:r>
-        <w:t>ASP.NET Core</w:t>
-      </w:r>
-      <w:bookmarkEnd w:id="10"/>
-    </w:p>
-    <w:p>
       <w:r>
         <w:t>ASP.NET Core egy platformfüggetlen, nagy teljesítményű, nyílt forráskódú keretrendszer, amely modern webalkalmazásokat készít a .NET használatával. A keretrendszer nagy léptékű alkalmazásfejlesztéshez készült, és bármilyen méretű számítási feladatot képes kezelni, így nagyvállalati szintű alkalmazások számára is robusztus választás.</w:t>
       </w:r>
@@ -4093,6 +4107,7 @@
     </w:p>
     <w:p>
       <w:r>
+        <w:lastRenderedPageBreak/>
         <w:t>Főbb előnyei:</w:t>
       </w:r>
     </w:p>
@@ -4264,38 +4279,110 @@
       <w:pPr>
         <w:pStyle w:val="Cmsor3"/>
       </w:pPr>
-      <w:bookmarkStart w:id="11" w:name="_Toc209525206"/>
+      <w:bookmarkStart w:id="10" w:name="_Toc209525206"/>
       <w:r>
         <w:t>Hitelesítés / Autorizáció</w:t>
       </w:r>
+      <w:bookmarkEnd w:id="10"/>
+    </w:p>
+    <w:p>
+      <w:pPr>
+        <w:pStyle w:val="Cmsor4"/>
+      </w:pPr>
+      <w:r>
+        <w:t>JwtBearer</w:t>
+      </w:r>
+    </w:p>
+    <w:p>
+      <w:r>
+        <w:t>E</w:t>
+      </w:r>
+      <w:r>
+        <w:t>gy ASP.NET Core alkalmazásokhoz tervezett köztes rétegű komponens. Lehetővé teszi a JSON Web Token (JWT) hitelesítést, lehetővé téve az API-k és webszolgáltatások biztonságos hitelesítését. Ez a csomag lehetővé teszi a hitelesítési szerver által kibocsátott JWT tokenek validálását, biztosítva az alkalmazás erőforrásaihoz való biztonságos hozzáférést.</w:t>
+      </w:r>
+      <w:r>
+        <w:fldChar w:fldCharType="begin"/>
+      </w:r>
+      <w:r>
+        <w:instrText xml:space="preserve"> REF _Ref209363742 \r \h </w:instrText>
+      </w:r>
+      <w:r>
+        <w:fldChar w:fldCharType="separate"/>
+      </w:r>
+      <w:r>
+        <w:t>[5]</w:t>
+      </w:r>
+      <w:r>
+        <w:fldChar w:fldCharType="end"/>
+      </w:r>
+    </w:p>
+    <w:p>
+      <w:pPr>
+        <w:pStyle w:val="Cmsor4"/>
+      </w:pPr>
+      <w:r>
+        <w:lastRenderedPageBreak/>
+        <w:t>Identity.EntityFrameworkCore</w:t>
+      </w:r>
+    </w:p>
+    <w:p>
+      <w:r>
+        <w:t>Beépített felhasználó/role kezelés.</w:t>
+      </w:r>
+    </w:p>
+    <w:p>
+      <w:pPr>
+        <w:pStyle w:val="Cmsor4"/>
+      </w:pPr>
+      <w:r>
+        <w:t>IdentityModel.Tokens.JWT</w:t>
+      </w:r>
+    </w:p>
+    <w:p>
+      <w:r>
+        <w:t>Tokenek létrehozása és validálása.</w:t>
+      </w:r>
+    </w:p>
+    <w:p>
+      <w:pPr>
+        <w:pStyle w:val="Cmsor3"/>
+      </w:pPr>
+      <w:bookmarkStart w:id="11" w:name="_Toc209525207"/>
+      <w:r>
+        <w:t>E-mail szolgáltatás</w:t>
+      </w:r>
       <w:bookmarkEnd w:id="11"/>
     </w:p>
     <w:p>
-      <w:pPr>
-        <w:pStyle w:val="Cmsor4"/>
-      </w:pPr>
-      <w:r>
-        <w:t>JwtBearer</w:t>
-      </w:r>
-    </w:p>
-    <w:p>
-      <w:r>
-        <w:t>E</w:t>
-      </w:r>
-      <w:r>
-        <w:t>gy ASP.NET Core alkalmazásokhoz tervezett köztes rétegű komponens. Lehetővé teszi a JSON Web Token (JWT) hitelesítést, lehetővé téve az API-k és webszolgáltatások biztonságos hitelesítését. Ez a csomag lehetővé teszi a hitelesítési szerver által kibocsátott JWT tokenek validálását, biztosítva az alkalmazás erőforrásaihoz való biztonságos hozzáférést.</w:t>
+      <w:r>
+        <w:t xml:space="preserve">A Mailjet REST API  </w:t>
+      </w:r>
+      <w:r>
+        <w:rPr>
+          <w:rStyle w:val="Lbjegyzet-hivatkozs"/>
+        </w:rPr>
+        <w:footnoteReference w:id="1"/>
+      </w:r>
+      <w:r>
+        <w:t>köré épül . Kiszámítható, erőforrás-orientált URL-ekkel rendelkezik, és HTTP válaszkódokat használ az API-hibák jelzésére. Minden kérés és válasz törzse JSON -ban van kódolva , beleértve a hibákat is. Az API-hoz HTTPS kérések küldésével lehet hozzáférni egy adott v</w:t>
+      </w:r>
+      <w:r>
+        <w:t>erziójú végpont URL-címére. GET,</w:t>
+      </w:r>
+      <w:r>
+        <w:t xml:space="preserve"> POST, PUT, és DELETE a metódusok határozzák meg, hogyan kommunikálsz az elérhető objektumokkal.</w:t>
       </w:r>
       <w:r>
         <w:fldChar w:fldCharType="begin"/>
       </w:r>
       <w:r>
-        <w:instrText xml:space="preserve"> REF _Ref209363742 \r \h </w:instrText>
+        <w:instrText xml:space="preserve"> REF _Ref209363480 \r \h </w:instrText>
       </w:r>
       <w:r>
         <w:fldChar w:fldCharType="separate"/>
       </w:r>
       <w:r>
-        <w:t>[5]</w:t>
+        <w:t>[4]</w:t>
       </w:r>
       <w:r>
         <w:fldChar w:fldCharType="end"/>
@@ -4303,121 +4390,54 @@
     </w:p>
     <w:p>
       <w:pPr>
-        <w:pStyle w:val="Cmsor4"/>
-      </w:pPr>
-      <w:r>
-        <w:t>Identity.EntityFrameworkCore</w:t>
-      </w:r>
-    </w:p>
-    <w:p>
-      <w:r>
-        <w:t>Beépített felhasználó/role kezelés.</w:t>
-      </w:r>
-    </w:p>
-    <w:p>
-      <w:pPr>
-        <w:pStyle w:val="Cmsor4"/>
-      </w:pPr>
-      <w:r>
-        <w:t>IdentityModel.Tokens.JWT</w:t>
-      </w:r>
-    </w:p>
-    <w:p>
-      <w:r>
-        <w:t>Tokenek létrehozása és validálása.</w:t>
-      </w:r>
-    </w:p>
-    <w:p>
-      <w:pPr>
         <w:pStyle w:val="Cmsor3"/>
       </w:pPr>
-      <w:bookmarkStart w:id="12" w:name="_Toc209525207"/>
-      <w:r>
-        <w:t>E-mail szolgáltatás</w:t>
+      <w:bookmarkStart w:id="12" w:name="_Toc209525208"/>
+      <w:r>
+        <w:t>OpenApi/Swagger</w:t>
       </w:r>
       <w:bookmarkEnd w:id="12"/>
-    </w:p>
-    <w:p>
-      <w:r>
-        <w:t xml:space="preserve">A Mailjet REST API  </w:t>
-      </w:r>
-      <w:r>
-        <w:rPr>
-          <w:rStyle w:val="Lbjegyzet-hivatkozs"/>
-        </w:rPr>
-        <w:footnoteReference w:id="1"/>
-      </w:r>
-      <w:r>
-        <w:t>köré épül . Kiszámítható, erőforrás-orientált URL-ekkel rendelkezik, és HTTP válaszkódokat használ az API-hibák jelzésére. Minden kérés és válasz törzse JSON -ban van kódolva , beleértve a hibákat is. Az API-hoz HTTPS kérések küldésével lehet hozzáférni egy adott v</w:t>
-      </w:r>
-      <w:r>
-        <w:t>erziójú végpont URL-címére. GET,</w:t>
-      </w:r>
-      <w:r>
-        <w:t xml:space="preserve"> POST, PUT, és DELETE a metódusok határozzák meg, hogyan kommunikálsz az elérhető objektumokkal.</w:t>
-      </w:r>
-      <w:r>
-        <w:fldChar w:fldCharType="begin"/>
-      </w:r>
-      <w:r>
-        <w:instrText xml:space="preserve"> REF _Ref209363480 \r \h </w:instrText>
-      </w:r>
-      <w:r>
-        <w:fldChar w:fldCharType="separate"/>
-      </w:r>
-      <w:r>
-        <w:t>[4]</w:t>
-      </w:r>
-      <w:r>
-        <w:fldChar w:fldCharType="end"/>
+      <w:r>
+        <w:t xml:space="preserve"> </w:t>
+      </w:r>
+    </w:p>
+    <w:p>
+      <w:r>
+        <w:t xml:space="preserve">Az OpenAPI specifikációt (OAS) 2015-ben adományozták a Linux Alapítványnak az OpenAPI kezdeményezés keretében. A specifikáció egy RESTful </w:t>
+      </w:r>
+      <w:r>
+        <w:t>felületethoz(interface)</w:t>
+      </w:r>
+      <w:r>
+        <w:t xml:space="preserve"> hoz létre az API-k egyszerű fejlesztéséhez és felhasználásához azáltal, hogy hatékonyan leképezi az összes hozzá kapcsolódó erőforrást és műveletet.</w:t>
+      </w:r>
+      <w:r>
+        <w:t xml:space="preserve"> </w:t>
+      </w:r>
+      <w:r>
+        <w:t>A Swagger eszközöket az eredeti „Swagger” specifikáció mögött álló csapat fejlesztette ki. A Swagger a leghatékonyabb és legkönnyebben használható eszközöket kínálja az OpenAPI specifikáció teljes kihasználásához.</w:t>
+      </w:r>
+      <w:r>
+        <w:t xml:space="preserve"> Egyszerűsítse munkafolyamatát. Egyszerűsítse API-ja építési folyamatát a tervezés, a dokumentáció és a megvalósítás automatikus szinkronizálásával és frissítésével.</w:t>
       </w:r>
     </w:p>
     <w:p>
       <w:pPr>
         <w:pStyle w:val="Cmsor3"/>
       </w:pPr>
-      <w:bookmarkStart w:id="13" w:name="_Toc209525208"/>
-      <w:r>
-        <w:t>OpenApi/Swagger</w:t>
+      <w:bookmarkStart w:id="13" w:name="_Toc209525209"/>
+      <w:r>
+        <w:t>NSwag</w:t>
       </w:r>
       <w:bookmarkEnd w:id="13"/>
-      <w:r>
-        <w:t xml:space="preserve"> </w:t>
-      </w:r>
-    </w:p>
-    <w:p>
-      <w:r>
-        <w:t xml:space="preserve">Az OpenAPI specifikációt (OAS) 2015-ben adományozták a Linux Alapítványnak az OpenAPI kezdeményezés keretében. A specifikáció egy RESTful </w:t>
-      </w:r>
-      <w:r>
-        <w:t>felületethoz(interface)</w:t>
-      </w:r>
-      <w:r>
-        <w:t xml:space="preserve"> hoz létre az API-k egyszerű fejlesztéséhez és felhasználásához azáltal, hogy hatékonyan leképezi az összes hozzá kapcsolódó erőforrást és műveletet.</w:t>
-      </w:r>
-      <w:r>
-        <w:t xml:space="preserve"> </w:t>
-      </w:r>
-      <w:r>
-        <w:t>A Swagger eszközöket az eredeti „Swagger” specifikáció mögött álló csapat fejlesztette ki. A Swagger a leghatékonyabb és legkönnyebben használható eszközöket kínálja az OpenAPI specifikáció teljes kihasználásához.</w:t>
-      </w:r>
-      <w:r>
-        <w:t xml:space="preserve"> Egyszerűsítse munkafolyamatát. Egyszerűsítse API-ja építési folyamatát a tervezés, a dokumentáció és a megvalósítás automatikus szinkronizálásával és frissítésével.</w:t>
-      </w:r>
-    </w:p>
-    <w:p>
-      <w:pPr>
-        <w:pStyle w:val="Cmsor3"/>
-      </w:pPr>
-      <w:bookmarkStart w:id="14" w:name="_Toc209525209"/>
-      <w:r>
-        <w:t>NSwag</w:t>
-      </w:r>
-      <w:bookmarkEnd w:id="14"/>
-    </w:p>
-    <w:p>
-      <w:r>
-        <w:t>Az NSwag egy Swagger/OpenAPI 2.0 és 3.0 eszköztár .NET, .NET Core, Web API, ASP.NET Core, TypeScript  és más platformokhoz, C# nyelven írva. Az OpenAPI/Swagger specifikáció JSON és JSON sémákat használ a RESTful webes API leírásához. Az NSwag projekt eszközöket biztosít OpenAPI specifikációk generálásához meglévő ASP.NET Web API vezérlőkből és klienskódból ezen OpenAPI specifikációk alapján.</w:t>
+    </w:p>
+    <w:p>
+      <w:r>
+        <w:t xml:space="preserve">Az NSwag egy Swagger/OpenAPI 2.0 és 3.0 eszköztár .NET, .NET Core, Web API, ASP.NET Core, TypeScript  és más platformokhoz, C# nyelven írva. Az OpenAPI/Swagger specifikáció JSON és JSON sémákat használ a RESTful webes API leírásához. Az NSwag projekt eszközöket biztosít OpenAPI specifikációk generálásához </w:t>
+      </w:r>
+      <w:r>
+        <w:lastRenderedPageBreak/>
+        <w:t>meglévő ASP.NET Web API vezérlőkből és klienskódból ezen OpenAPI specifikációk alapján.</w:t>
       </w:r>
       <w:r>
         <w:fldChar w:fldCharType="begin"/>
@@ -4491,65 +4511,131 @@
       <w:pPr>
         <w:pStyle w:val="Kpalrs"/>
       </w:pPr>
+      <w:fldSimple w:instr=" STYLEREF 3 \s ">
+        <w:r>
+          <w:rPr>
+            <w:noProof/>
+          </w:rPr>
+          <w:t>2.2.4</w:t>
+        </w:r>
+      </w:fldSimple>
+      <w:r>
+        <w:noBreakHyphen/>
+      </w:r>
+      <w:fldSimple w:instr=" SEQ ábra \* ARABIC \s 3 ">
+        <w:r>
+          <w:rPr>
+            <w:noProof/>
+          </w:rPr>
+          <w:t>1</w:t>
+        </w:r>
+      </w:fldSimple>
+      <w:r>
+        <w:t xml:space="preserve">. ábra </w:t>
+      </w:r>
+      <w:bookmarkStart w:id="14" w:name="_GoBack"/>
+      <w:r>
+        <w:t>Nswag generálás folyamata</w:t>
+      </w:r>
+      <w:bookmarkEnd w:id="14"/>
       <w:r>
         <w:fldChar w:fldCharType="begin"/>
       </w:r>
       <w:r>
-        <w:instrText xml:space="preserve"> STYLEREF 3 \s </w:instrText>
+        <w:instrText xml:space="preserve"> REF _Ref209364537 \r \h </w:instrText>
       </w:r>
       <w:r>
         <w:fldChar w:fldCharType="separate"/>
       </w:r>
       <w:r>
-        <w:rPr>
-          <w:noProof/>
-        </w:rPr>
-        <w:t>2.2.4</w:t>
-      </w:r>
-      <w:r>
-        <w:rPr>
-          <w:noProof/>
-        </w:rPr>
+        <w:t>[6]</w:t>
+      </w:r>
+      <w:r>
         <w:fldChar w:fldCharType="end"/>
       </w:r>
-      <w:r>
-        <w:noBreakHyphen/>
+    </w:p>
+    <w:p>
+      <w:pPr>
+        <w:pStyle w:val="Cmsor4"/>
+      </w:pPr>
+      <w:r>
+        <w:t>Entity Framework</w:t>
+      </w:r>
+    </w:p>
+    <w:p>
+      <w:pPr>
+        <w:ind w:firstLine="0"/>
+      </w:pPr>
+      <w:r>
+        <w:t>Az Entity Framework egy modern objektum-relációs leképező, amellyel tiszta, hordozható és magas szintű adatelérési réteget hozhat</w:t>
+      </w:r>
+      <w:r>
+        <w:t>ó</w:t>
+      </w:r>
+      <w:r>
+        <w:t xml:space="preserve"> létre .NET (C#) használatával számos különböző adatbázison, például az SQL Database-en, az SQLite-en, a MySQL-en, a PostgreSQL-en. Támogatja a LINQ-lekérdezéseket, a változáskövetést, a frissítéseket és a séma</w:t>
+      </w:r>
+      <w:r>
+        <w:t xml:space="preserve"> </w:t>
+      </w:r>
+      <w:r>
+        <w:t>migrálásokat.</w:t>
       </w:r>
       <w:r>
         <w:fldChar w:fldCharType="begin"/>
       </w:r>
       <w:r>
-        <w:instrText xml:space="preserve"> SEQ ábra \* ARABIC \s 3 </w:instrText>
+        <w:instrText xml:space="preserve"> REF _Ref209365059 \r \h </w:instrText>
       </w:r>
       <w:r>
         <w:fldChar w:fldCharType="separate"/>
       </w:r>
       <w:r>
-        <w:rPr>
-          <w:noProof/>
-        </w:rPr>
-        <w:t>1</w:t>
-      </w:r>
-      <w:r>
-        <w:rPr>
-          <w:noProof/>
-        </w:rPr>
+        <w:t>[7]</w:t>
+      </w:r>
+      <w:r>
         <w:fldChar w:fldCharType="end"/>
       </w:r>
-      <w:r>
-        <w:t>. ábra Nswag generálás folyamata</w:t>
+    </w:p>
+    <w:p>
+      <w:pPr>
+        <w:pStyle w:val="Cmsor2"/>
+      </w:pPr>
+      <w:bookmarkStart w:id="15" w:name="_Toc209525210"/>
+      <w:r>
+        <w:t>Kliens oldali technológiák:</w:t>
+      </w:r>
+      <w:bookmarkEnd w:id="15"/>
+    </w:p>
+    <w:p>
+      <w:pPr>
+        <w:pStyle w:val="Cmsor3"/>
+      </w:pPr>
+      <w:bookmarkStart w:id="16" w:name="_Toc209525211"/>
+      <w:r>
+        <w:t>HTML</w:t>
+      </w:r>
+      <w:bookmarkEnd w:id="16"/>
+    </w:p>
+    <w:p>
+      <w:r>
+        <w:t xml:space="preserve">A HTML - azaz a Hypertext Markup Language - egy hiperszöveges leírónyelv. Egyfajta programozási előírás, ami megadja azt, hogyan is kell a weboldalakat írni úgy, hogy azokat megértse és megfelelően meg is jelenítse a számítógép. A neve a következőkre utal: Hypertext szöveg, ami a hipertérben (más szóval az interneten) található, mely egy formázatlan szöveg. A szöveget Markup language segítségével lehet formázni, szabványszerű jel és kódkészletet tartalmaz, amit a böngésző képes értelmezni. A HTML-t 1990 óta használják weboldalak tervezésére. Olyan szöveges fájlokról van szó, amiket akár szövegszerkesztővel is tudunk módosítani. Az ebben megtalálható szövegek és szimbólumok írják le a böngészők számára, hogyan legyen 11 megjelenítve </w:t>
+      </w:r>
+      <w:r>
+        <w:lastRenderedPageBreak/>
+        <w:t>a weboldal. Elsődleges célja a dokumentumok megjelenítése volt, nem pedig a sokoldalú formázás, stílus. A későbbiekben - 1996-ban - jelent meg a HTML 3.0, a nyelv olyan újítása, ahol már script is beágyazásra kerülhet, ezáltal az eddig statikus kódot már dinamikussá lehetet alakítani. Ekkor jelent meg a stílus is, amivel egyszerre érkeztek a tartalomformázási lehetőségek. A 90-es évek végén a HTML 4.0-ban jelent meg a nemzetközi karakterkészlet használat. 2011-ben jelent meg a HTML 5, amivel a beágyazott videó- és audió tartalmak kezelésére koncentráltak.</w:t>
       </w:r>
       <w:r>
         <w:fldChar w:fldCharType="begin"/>
       </w:r>
       <w:r>
-        <w:instrText xml:space="preserve"> REF _Ref209364537 \r \h </w:instrText>
+        <w:instrText xml:space="preserve"> REF _Ref209359631 \r \h </w:instrText>
       </w:r>
       <w:r>
         <w:fldChar w:fldCharType="separate"/>
       </w:r>
       <w:r>
-        <w:t>[6]</w:t>
+        <w:t>[1]</w:t>
       </w:r>
       <w:r>
         <w:fldChar w:fldCharType="end"/>
@@ -4557,198 +4643,119 @@
     </w:p>
     <w:p>
       <w:pPr>
-        <w:pStyle w:val="Cmsor4"/>
-      </w:pPr>
-      <w:r>
-        <w:t>Entity Framework</w:t>
-      </w:r>
-    </w:p>
-    <w:p>
-      <w:pPr>
-        <w:ind w:firstLine="0"/>
-      </w:pPr>
-      <w:r>
-        <w:t>Az Entity Framework egy modern objektum-relációs leképező, amellyel tiszta, hordozható és magas szintű adatelérési réteget hozhat</w:t>
-      </w:r>
-      <w:r>
-        <w:t>ó</w:t>
-      </w:r>
-      <w:r>
-        <w:t xml:space="preserve"> létre .NET (C#) használatával számos különböző adatbázison, például az SQL Database-en, az SQLite-en, a MySQL-en, a PostgreSQL-en. Támogatja a LINQ-lekérdezéseket, a változáskövetést, a frissítéseket és a séma</w:t>
+        <w:pStyle w:val="Cmsor3"/>
+      </w:pPr>
+      <w:bookmarkStart w:id="17" w:name="_Toc209525212"/>
+      <w:r>
+        <w:t>CSS</w:t>
+      </w:r>
+      <w:bookmarkEnd w:id="17"/>
+    </w:p>
+    <w:p>
+      <w:r>
+        <w:t xml:space="preserve">A CSS vagyis a Cascading Style Sheets (egymásba ágyazott stíluslapok), egyfajta stílusleíró nyelv. A CSS szabályok segítségével szabhatjuk testre az oldal megjelenítését. Meghatározhatjuk többek között azt, milyen elrendezésű legyen az oldal, kiválaszthatjuk a színeket, betűkészletet is. Többfajta stílus adható egy oldalnak. Inline: tehát sorközi CSS, vagyis a forráskódban szerepel, a megváltoztatni kívánt elem címkéjében. Internal: belső CSS; a forráskódban szerepel, azon belül is a Head részen helyezkedik el. Innen csak az adott oldal stílusát lehet változtatni. External: ezáltal külső CSS; külön .css fájlba kell elmenteni, a Head részen helyezkedik el hivatkozva. Előnye (az Internalhoz képest), hogy nem kell a kódrészletet mindig behelyezni az adott oldal Head-jébe, hanem csak a </w:t>
+      </w:r>
+      <w:r>
+        <w:t>.css fájlt kell behivatkozni.</w:t>
+      </w:r>
+      <w:r>
+        <w:t xml:space="preserve"> A HTML lehetőséget ad arra, hogy a stílust beleírjuk a HTML lap szövegébe, a böngésző pedig arra, hogy létrehozzunk CSS stílusokat. Manapság azonban már a legtöbb weblapon beépített stílus van. A működési elve alapvetően az, hogy a böngészők megnézik, az adott weblaphoz</w:t>
+      </w:r>
+      <w:r>
+        <w:t xml:space="preserve"> milyen CSS tartozik és ez alapján jeleníti meg a HTML vagy a XHTML fájlt.</w:t>
+      </w:r>
+      <w:r>
+        <w:fldChar w:fldCharType="begin"/>
+      </w:r>
+      <w:r>
+        <w:instrText xml:space="preserve"> REF _Ref209359631 \r \h </w:instrText>
+      </w:r>
+      <w:r>
+        <w:fldChar w:fldCharType="separate"/>
+      </w:r>
+      <w:r>
+        <w:t>[1]</w:t>
+      </w:r>
+      <w:r>
+        <w:fldChar w:fldCharType="end"/>
+      </w:r>
+    </w:p>
+    <w:p>
+      <w:pPr>
+        <w:pStyle w:val="Cmsor3"/>
+      </w:pPr>
+      <w:bookmarkStart w:id="18" w:name="_Toc209525213"/>
+      <w:r>
+        <w:t>Bootstrap</w:t>
+      </w:r>
+      <w:bookmarkEnd w:id="18"/>
+    </w:p>
+    <w:p>
+      <w:r>
+        <w:t xml:space="preserve">A Bootstrap ingyenes, nyílt forráskóddal rendelkező kliens felőli keretrendszer, amely segít a fejlesztőknek a webes felület kialakításában. A Twitter Inc. vállalatnál fejlesztette ki Mark Otto és Jacob Thornton a belső eszközök összehangolása véget. Nyilvánossá 2011. augusztusában tették, azóta is folyamatosan fejlődő, nagy közösségnek örvendő kliens oldali keretrendszer. Egyik fő verziónak számító Bootsrap 4-et 2015-ben adták ki, a következő verziója 2021-ben jelent meg, a Bootsrap 5, ami már nem használ JQUERY könyvtárat és modernebb komponensek jelentek meg benne. A Bootstrap CSS-t, HTML-t vagy JavaScript kódrészleteket használ. A Bootstrap által 12 Függőség: A függőség olyan funkció, kódrészlet, könyvtár, amely elengedhetetlen a kód </w:t>
+      </w:r>
+      <w:r>
+        <w:lastRenderedPageBreak/>
+        <w:t>val</w:t>
+      </w:r>
+      <w:r>
+        <w:t>amely részének működéseshez. E</w:t>
+      </w:r>
+      <w:r>
+        <w:t>gyszerűbben és könnyebben lehet reszponzív weboldalakat alkotni. A fejlesztők számára a jó dokumentáció is nagy előny, általa sokkal könnyebb megoldani a felmerülő akadályokat, és emellett magas a személyre szabhatósága is. Megfelelő használata mellett a weboldalakat úgy lehet felépíteni, hogy szinte minden eszközön szépen jelenjen meg. Bootstrap hivatalos oldala tömérdek előre megalkotott sablonnal rendelkezik, például űrlapok, táblázatok, navigációs menük, gombok. Úgy gondolom, hogy a Bootstrap legkiemelkedőbb eleme a Grid, a szó durva fordításban „rács struktúrát” jelent. Általa a megjelenítendő elemeinket, rácsszerkezetbe tudjuk rendezni, így a megfelelő kialakítás által az oldal reszponzívvá válik.</w:t>
+      </w:r>
+      <w:r>
+        <w:fldChar w:fldCharType="begin"/>
+      </w:r>
+      <w:r>
+        <w:instrText xml:space="preserve"> REF _Ref209359631 \r \h </w:instrText>
+      </w:r>
+      <w:r>
+        <w:fldChar w:fldCharType="separate"/>
+      </w:r>
+      <w:r>
+        <w:t>[1]</w:t>
+      </w:r>
+      <w:r>
+        <w:fldChar w:fldCharType="end"/>
+      </w:r>
+    </w:p>
+    <w:p>
+      <w:pPr>
+        <w:pStyle w:val="Cmsor3"/>
+      </w:pPr>
+      <w:bookmarkStart w:id="19" w:name="_Toc209525214"/>
+      <w:r>
+        <w:t>JavaSricpt</w:t>
+      </w:r>
+      <w:bookmarkEnd w:id="19"/>
+    </w:p>
+    <w:p>
+      <w:r>
+        <w:t xml:space="preserve">A JavaScript első verzióját 1995-ben mutatták be. Ez </w:t>
+      </w:r>
+      <w:r>
+        <w:t>volt az első webes parancsnyelv</w:t>
+      </w:r>
+      <w:r>
+        <w:rPr>
+          <w:rStyle w:val="Lbjegyzet-hivatkozs"/>
+        </w:rPr>
+        <w:footnoteReference w:id="2"/>
+      </w:r>
+      <w:r>
+        <w:t xml:space="preserve"> is. A tervezője a Netscape Communications Corporation. Eredetileg </w:t>
+      </w:r>
+      <w:r>
+        <w:t>LiveScript volt a neve, melyet a későbbiek folyamán megváltoztattak. A JavaScript nyelven megírt kódot elhelyezhetjük a HTML fájlban is, úgymint a HTML dokumentum fejlécében és törzsében is külön fájlban. A HTML elemen belül (például a</w:t>
+      </w:r>
+      <w:r>
+        <w:t xml:space="preserve"> &lt;body&gt;</w:t>
       </w:r>
       <w:r>
         <w:t xml:space="preserve"> </w:t>
       </w:r>
       <w:r>
-        <w:t>migrálásokat.</w:t>
-      </w:r>
-      <w:r>
-        <w:fldChar w:fldCharType="begin"/>
-      </w:r>
-      <w:r>
-        <w:instrText xml:space="preserve"> REF _Ref209365059 \r \h </w:instrText>
-      </w:r>
-      <w:r>
-        <w:fldChar w:fldCharType="separate"/>
-      </w:r>
-      <w:r>
-        <w:t>[7]</w:t>
-      </w:r>
-      <w:r>
-        <w:fldChar w:fldCharType="end"/>
-      </w:r>
-    </w:p>
-    <w:p>
-      <w:pPr>
-        <w:pStyle w:val="Cmsor2"/>
-      </w:pPr>
-      <w:bookmarkStart w:id="15" w:name="_Toc209525210"/>
-      <w:r>
-        <w:t>Kliens oldali technológiák:</w:t>
-      </w:r>
-      <w:bookmarkEnd w:id="15"/>
-    </w:p>
-    <w:p>
-      <w:pPr>
-        <w:pStyle w:val="Cmsor3"/>
-      </w:pPr>
-      <w:bookmarkStart w:id="16" w:name="_Toc209525211"/>
-      <w:r>
-        <w:t>HTML</w:t>
-      </w:r>
-      <w:bookmarkEnd w:id="16"/>
-    </w:p>
-    <w:p>
-      <w:r>
-        <w:t>A HTML - azaz a Hypertext Markup Language - egy hiperszöveges leírónyelv. Egyfajta programozási előírás, ami megadja azt, hogyan is kell a weboldalakat írni úgy, hogy azokat megértse és megfelelően meg is jelenítse a számítógép. A neve a következőkre utal: Hypertext szöveg, ami a hipertérben (más szóval az interneten) található, mely egy formázatlan szöveg. A szöveget Markup language segítségével lehet formázni, szabványszerű jel és kódkészletet tartalmaz, amit a böngésző képes értelmezni. A HTML-t 1990 óta használják weboldalak tervezésére. Olyan szöveges fájlokról van szó, amiket akár szövegszerkesztővel is tudunk módosítani. Az ebben megtalálható szövegek és szimbólumok írják le a böngészők számára, hogyan legyen 11 megjelenítve a weboldal. Elsődleges célja a dokumentumok megjelenítése volt, nem pedig a sokoldalú formázás, stílus. A későbbiekben - 1996-ban - jelent meg a HTML 3.0, a nyelv olyan újítása, ahol már script is beágyazásra kerülhet, ezáltal az eddig statikus kódot már dinamikussá lehetet alakítani. Ekkor jelent meg a stílus is, amivel egyszerre érkeztek a tartalomformázási lehetőségek. A 90-es évek végén a HTML 4.0-ban jelent meg a nemzetközi karakterkészlet használat. 2011-ben jelent meg a HTML 5, amivel a beágyazott videó- és audió tartalmak kezelésére koncentráltak.</w:t>
-      </w:r>
-      <w:r>
-        <w:fldChar w:fldCharType="begin"/>
-      </w:r>
-      <w:r>
-        <w:instrText xml:space="preserve"> REF _Ref209359631 \r \h </w:instrText>
-      </w:r>
-      <w:r>
-        <w:fldChar w:fldCharType="separate"/>
-      </w:r>
-      <w:r>
-        <w:t>[1]</w:t>
-      </w:r>
-      <w:r>
-        <w:fldChar w:fldCharType="end"/>
-      </w:r>
-    </w:p>
-    <w:p>
-      <w:pPr>
-        <w:pStyle w:val="Cmsor3"/>
-      </w:pPr>
-      <w:bookmarkStart w:id="17" w:name="_Toc209525212"/>
-      <w:r>
-        <w:t>CSS</w:t>
-      </w:r>
-      <w:bookmarkEnd w:id="17"/>
-    </w:p>
-    <w:p>
-      <w:r>
-        <w:t xml:space="preserve">A CSS vagyis a Cascading Style Sheets (egymásba ágyazott stíluslapok), egyfajta stílusleíró nyelv. A CSS szabályok segítségével szabhatjuk testre az oldal megjelenítését. Meghatározhatjuk többek között azt, milyen elrendezésű legyen az oldal, kiválaszthatjuk a színeket, betűkészletet is. Többfajta stílus adható egy oldalnak. Inline: tehát sorközi CSS, vagyis a forráskódban szerepel, a megváltoztatni kívánt elem címkéjében. Internal: belső CSS; a forráskódban szerepel, azon belül is a Head részen helyezkedik el. Innen csak az adott oldal stílusát lehet változtatni. External: ezáltal külső CSS; külön .css fájlba kell elmenteni, a Head részen helyezkedik el hivatkozva. Előnye (az Internalhoz képest), hogy nem kell a kódrészletet mindig behelyezni az adott oldal Head-jébe, hanem csak a </w:t>
-      </w:r>
-      <w:r>
-        <w:t>.css fájlt kell behivatkozni.</w:t>
-      </w:r>
-      <w:r>
-        <w:t xml:space="preserve"> A HTML lehetőséget ad arra, hogy a stílust beleírjuk a HTML lap szövegébe, a böngésző pedig arra, hogy létrehozzunk CSS stílusokat. Manapság azonban már a legtöbb weblapon beépített stílus van. A működési elve alapvetően az, hogy a böngészők megnézik, az adott weblaphoz</w:t>
-      </w:r>
-      <w:r>
-        <w:t xml:space="preserve"> milyen CSS tartozik és ez alapján jeleníti meg a HTML vagy a XHTML fájlt.</w:t>
-      </w:r>
-      <w:r>
-        <w:fldChar w:fldCharType="begin"/>
-      </w:r>
-      <w:r>
-        <w:instrText xml:space="preserve"> REF _Ref209359631 \r \h </w:instrText>
-      </w:r>
-      <w:r>
-        <w:fldChar w:fldCharType="separate"/>
-      </w:r>
-      <w:r>
-        <w:t>[1]</w:t>
-      </w:r>
-      <w:r>
-        <w:fldChar w:fldCharType="end"/>
-      </w:r>
-    </w:p>
-    <w:p>
-      <w:pPr>
-        <w:pStyle w:val="Cmsor3"/>
-      </w:pPr>
-      <w:bookmarkStart w:id="18" w:name="_Toc209525213"/>
-      <w:r>
-        <w:t>Bootstrap</w:t>
-      </w:r>
-      <w:bookmarkEnd w:id="18"/>
-    </w:p>
-    <w:p>
-      <w:r>
-        <w:t>A Bootstrap ingyenes, nyílt forráskóddal rendelkező kliens felőli keretrendszer, amely segít a fejlesztőknek a webes felület kialakításában. A Twitter Inc. vállalatnál fejlesztette ki Mark Otto és Jacob Thornton a belső eszközök összehangolása véget. Nyilvánossá 2011. augusztusában tették, azóta is folyamatosan fejlődő, nagy közösségnek örvendő kliens oldali keretrendszer. Egyik fő verziónak számító Bootsrap 4-et 2015-ben adták ki, a következő verziója 2021-ben jelent meg, a Bootsrap 5, ami már nem használ JQUERY könyvtárat és modernebb komponensek jelentek meg benne. A Bootstrap CSS-t, HTML-t vagy JavaScript kódrészleteket használ. A Bootstrap által 12 Függőség: A függőség olyan funkció, kódrészlet, könyvtár, amely elengedhetetlen a kód val</w:t>
-      </w:r>
-      <w:r>
-        <w:t>amely részének működéseshez. E</w:t>
-      </w:r>
-      <w:r>
-        <w:t>gyszerűbben és könnyebben lehet reszponzív weboldalakat alkotni. A fejlesztők számára a jó dokumentáció is nagy előny, általa sokkal könnyebb megoldani a felmerülő akadályokat, és emellett magas a személyre szabhatósága is. Megfelelő használata mellett a weboldalakat úgy lehet felépíteni, hogy szinte minden eszközön szépen jelenjen meg. Bootstrap hivatalos oldala tömérdek előre megalkotott sablonnal rendelkezik, például űrlapok, táblázatok, navigációs menük, gombok. Úgy gondolom, hogy a Bootstrap legkiemelkedőbb eleme a Grid, a szó durva fordításban „rács struktúrát” jelent. Általa a megjelenítendő elemeinket, rácsszerkezetbe tudjuk rendezni, így a megfelelő kialakítás által az oldal reszponzívvá válik.</w:t>
-      </w:r>
-      <w:r>
-        <w:fldChar w:fldCharType="begin"/>
-      </w:r>
-      <w:r>
-        <w:instrText xml:space="preserve"> REF _Ref209359631 \r \h </w:instrText>
-      </w:r>
-      <w:r>
-        <w:fldChar w:fldCharType="separate"/>
-      </w:r>
-      <w:r>
-        <w:t>[1]</w:t>
-      </w:r>
-      <w:r>
-        <w:fldChar w:fldCharType="end"/>
-      </w:r>
-    </w:p>
-    <w:p>
-      <w:pPr>
-        <w:pStyle w:val="Cmsor3"/>
-      </w:pPr>
-      <w:bookmarkStart w:id="19" w:name="_Toc209525214"/>
-      <w:r>
-        <w:t>JavaSricpt</w:t>
-      </w:r>
-      <w:bookmarkEnd w:id="19"/>
-    </w:p>
-    <w:p>
-      <w:r>
-        <w:t xml:space="preserve">A JavaScript első verzióját 1995-ben mutatták be. Ez </w:t>
-      </w:r>
-      <w:r>
-        <w:t>volt az első webes parancsnyelv</w:t>
-      </w:r>
-      <w:r>
-        <w:rPr>
-          <w:rStyle w:val="Lbjegyzet-hivatkozs"/>
-        </w:rPr>
-        <w:footnoteReference w:id="2"/>
-      </w:r>
-      <w:r>
-        <w:t xml:space="preserve"> is. A tervezője a Netscape Communications Corporation. Eredetileg </w:t>
-      </w:r>
-      <w:r>
-        <w:t>LiveScript volt a neve, melyet a későbbiek folyamán megváltoztattak. A JavaScript nyelven megírt kódot elhelyezhetjük a HTML fájlban is, úgymint a HTML dokumentum fejlécében és törzsében is külön fájlban. A HTML elemen belül (például a</w:t>
-      </w:r>
-      <w:r>
-        <w:t xml:space="preserve"> &lt;body&gt;</w:t>
-      </w:r>
-      <w:r>
-        <w:t xml:space="preserve"> </w:t>
-      </w:r>
-      <w:r>
         <w:t xml:space="preserve">vagy &lt;form&gt; </w:t>
       </w:r>
       <w:r>
@@ -4776,7 +4783,11 @@
         <w:t xml:space="preserve">elem jelzi a böngészőnek, hogy a továbbiakban parancsok fognak következni a ’’&lt;script&gt;’’ </w:t>
       </w:r>
       <w:r>
-        <w:t>elemig. Mindezek mellett találhatóak benne kivételek is, például az eseménykezelők. A JavaScript kód megjelenítéséhez általában böngészőket használunk. Előfordulhat olyan is, hogy különböző böngészők más végeredményt szolgáltatnak (ez lehet hibaüzenet, de akár a kereső is leállhat). A nyelv használható a weben kívül is, azaz a kiszolgáló oldalán, a webkiszolgálón. A JavaScript és a kiszolgálói nyelvek között az egyik legnagyobb különbség az, hogy a JavaScript nyelvet a böngésző futtatja, míg a kiszolgálói nyelvet az adott webkiszolgáló (mely az adatok küldése miatt előfordulhat, hogy lassú). A programozási nyelvben több általános műveletet lehet végrehajtani, mint például: változó deklarálás, függvények létrehozása, hívása, saját osztály létrehozása. Használható még a JavaScript a reklámok és üzenetek megjelenítésére az adott weboldalon vagy külön ablakban, tartalom ellenőrzésére (akár a futó böngészőnek a típusa is ellenőrizhető), mindezek mellett a böngészőre telepített bővítményt vagy annak hiányát is jelezheti a felhasználónak. A JavaScript egy folyamatosan fejlődő nyelv.</w:t>
+        <w:t xml:space="preserve">elemig. Mindezek mellett találhatóak benne kivételek is, például az eseménykezelők. A JavaScript kód megjelenítéséhez általában böngészőket használunk. Előfordulhat olyan is, hogy különböző böngészők más végeredményt szolgáltatnak (ez lehet hibaüzenet, de akár a kereső is leállhat). A nyelv használható a weben kívül is, azaz a kiszolgáló oldalán, a webkiszolgálón. A JavaScript és a kiszolgálói nyelvek között az egyik legnagyobb különbség az, hogy a JavaScript nyelvet a böngésző futtatja, míg a kiszolgálói nyelvet az adott webkiszolgáló (mely az adatok küldése miatt előfordulhat, hogy lassú). A programozási nyelvben több általános műveletet lehet végrehajtani, mint például: változó deklarálás, függvények létrehozása, hívása, saját osztály létrehozása. Használható még a JavaScript a reklámok és üzenetek megjelenítésére az adott weboldalon vagy külön ablakban, tartalom ellenőrzésére (akár a </w:t>
+      </w:r>
+      <w:r>
+        <w:lastRenderedPageBreak/>
+        <w:t>futó böngészőnek a típusa is ellenőrizhető), mindezek mellett a böngészőre telepített bővítményt vagy annak hiányát is jelezheti a felhasználónak. A JavaScript egy folyamatosan fejlődő nyelv.</w:t>
       </w:r>
       <w:r>
         <w:fldChar w:fldCharType="begin"/>
@@ -4963,7 +4974,11 @@
         <w:footnoteReference w:id="5"/>
       </w:r>
       <w:r>
-        <w:t>, mindemellett mozgatható is az adatbázisa és sok nyelvlehetőséget biztosít a kezelésére. A MySQL képes egyszerre akár több adatbázist is kezelni, ebből adódóan az adatbázisokra nevekkel lehet utalni. Az általa használt SQL nyelvben egyaránt alkalmazható kis- és nagybetű, nem tesz benne különbséget a program. Az idők folyamán kialakult egy olyan habitus, ami által a parancsokat nagybetűkkel, a kiegészítéseket pedig kisbetűkkel írják. Az adatbázison többféleképpen lehet műveleteket végrehajtani. Az egyik mód, az előbb említett konzolon keresztüli használat, ami azt eredményezi, hogy nem függ az adatbáziskezelő rendszertől. A MySQL segítségével van lehetőség akár az űrlap adatok biztonságos elmentésére, aminek segítségével eltárolódik az adat addig, amíg a későbbiek folyamán szükség nem lesz rá, akkor pedig általa lehetőség nyílik az adatok kinyerésére.</w:t>
+        <w:t xml:space="preserve">, mindemellett mozgatható is az adatbázisa és sok nyelvlehetőséget biztosít a </w:t>
+      </w:r>
+      <w:r>
+        <w:lastRenderedPageBreak/>
+        <w:t>kezelésére. A MySQL képes egyszerre akár több adatbázist is kezelni, ebből adódóan az adatbázisokra nevekkel lehet utalni. Az általa használt SQL nyelvben egyaránt alkalmazható kis- és nagybetű, nem tesz benne különbséget a program. Az idők folyamán kialakult egy olyan habitus, ami által a parancsokat nagybetűkkel, a kiegészítéseket pedig kisbetűkkel írják. Az adatbázison többféleképpen lehet műveleteket végrehajtani. Az egyik mód, az előbb említett konzolon keresztüli használat, ami azt eredményezi, hogy nem függ az adatbáziskezelő rendszertől. A MySQL segítségével van lehetőség akár az űrlap adatok biztonságos elmentésére, aminek segítségével eltárolódik az adat addig, amíg a későbbiek folyamán szükség nem lesz rá, akkor pedig általa lehetőség nyílik az adatok kinyerésére.</w:t>
       </w:r>
       <w:r>
         <w:fldChar w:fldCharType="begin"/>
@@ -5002,7 +5017,11 @@
         <w:footnoteReference w:id="6"/>
       </w:r>
       <w:r>
-        <w:t>eltárolása. Erre ad lehetőséget a fájlrendszer. Ez a tárolási funkció az operációs rendszer egy alapfeladata közé sorolandó. A fájlrendszer pontos megfogalmazás szerint: absztrakt adatfajták összessége, fájlok kezelése, hozzáférése, navigálása, visszakereshetőségre, raktározására és kategorizálására kialakított architektúra egy háttértároló egységen. Ez lehet pendrive, ssd, merevlemez vagy esetleg annak valamely része, partíciója. Az állományokra a fájlrendszerben név alapján lehet hivatkozni. A fájlrendszerben definiálásra kerül az is, hogy a felhasználó mekkora tárterülettel gazdálkodhat. A jogosultság kezelése mellett, a fájlok megnyitásának, módosításának, áthelyezésének naplózása, titkosítása és tömörítése valósul meg. Napjainkban szerteágazó formában léteznek eltérő fájlrendszerek például olyanok, melyek biztosítják a hozzáférhetőséget a protokoll által a szervereken lévő adathalmazhoz, illetve a helyi és virtuális fájlrendszerhez. Általánosan elmondható a fájlrendszerekről, hogy háttértárak által biztosítanak elérhető, szabad területet. A rendszer feladatvégrehajtás közben megállapítja, hogy melyek a szabad szektorok, amihez fájlt rendelhet, és melyek foglaltak. A rendszereket lehet adatok ábrázolására és rendezésére is használni, ha az elérési útvonala vagy az elhelyezése dinamikusan történik metaadatok által, ami integrálja az állományhoz tartozó nevet és magát a fájlt.</w:t>
+        <w:t xml:space="preserve">eltárolása. Erre ad lehetőséget a fájlrendszer. Ez a tárolási funkció az operációs rendszer egy alapfeladata közé sorolandó. A fájlrendszer pontos megfogalmazás szerint: absztrakt adatfajták összessége, fájlok kezelése, hozzáférése, navigálása, visszakereshetőségre, raktározására és kategorizálására kialakított architektúra egy háttértároló egységen. Ez lehet pendrive, ssd, merevlemez vagy esetleg annak valamely része, partíciója. Az állományokra a fájlrendszerben név alapján lehet hivatkozni. A fájlrendszerben definiálásra kerül az is, hogy a felhasználó mekkora tárterülettel gazdálkodhat. A jogosultság kezelése mellett, a fájlok megnyitásának, módosításának, áthelyezésének naplózása, titkosítása és tömörítése valósul meg. Napjainkban szerteágazó formában léteznek eltérő fájlrendszerek például olyanok, melyek biztosítják a hozzáférhetőséget a protokoll által a szervereken lévő adathalmazhoz, illetve a helyi és virtuális fájlrendszerhez. Általánosan elmondható a fájlrendszerekről, hogy háttértárak által biztosítanak elérhető, szabad területet. A rendszer feladatvégrehajtás közben megállapítja, hogy melyek a szabad szektorok, amihez fájlt rendelhet, és melyek foglaltak. A rendszereket lehet adatok ábrázolására és rendezésére is használni, ha az elérési útvonala vagy az elhelyezése </w:t>
+      </w:r>
+      <w:r>
+        <w:lastRenderedPageBreak/>
+        <w:t>dinamikusan történik metaadatok által, ami integrálja az állományhoz tartozó nevet és magát a fájlt.</w:t>
       </w:r>
       <w:r>
         <w:fldChar w:fldCharType="begin"/>
@@ -5132,7 +5151,11 @@
     </w:p>
     <w:p>
       <w:r>
-        <w:t>A GitHub alapja egy verziókezelő rendszer, pontosabban a Git. Ez egy nyílt forráskódú verziókezelő szoftver. A feladata, hogy a programozó az addig elért összes verziót tárolja a programjáról, aminek az állapotai elmentésre kerültek. A Git a hangsúlyt a gyorsaságra helyezi, vagyis a parancsok a felhasználó gépén hajtódnak végre. Az adatok elmentésére a tároló egység szolgál. A verziókezelő rendszer egésze abban rejlik, hogy az elmentett állapot egy teljes értékű programot takar. Általa tisztán lehet követni, hogy a módosítások hol és mikor történtek. Ezáltal bármikor vissza lehet térni az előző állapot egyikére, ha a jelenlegi verzió meghibásodna, elveszne akár önhibából vagy külső hatásból. Például egy előző verzió meglévő funkcióit más egyéb irányba ágazó funkciókkal lehet kiegészíteni, de ekkor a felhasználásra kívánt verziót le kell másolni (clone). Emiatt akár egy új ágat (branch) lehet létrehozni a fejlesztés során, ami egy teljesen más irányba visz el az eddigi fejlesztéstől úgy, hogy a kiinduló verziót nem befolyásoljuk a sajátunkkal. A verzió neve az aktuális fejlesztő megadott neve és az aktuális dátumból tevődik össze. A fejlesztés során mindig van egy kiinduló ág, ezt master-nek nevezik - ez a fő ág -, ebből lehetséges új ágakat vagyis branch-eket létrehozni. Csapatmunka során, ha úgy adódik az is lényeges, hogy más is tudja használni az általunk megírt kódot, vagyis ne csak lokálisan létezzen. A Git által a tárolókat (repository) szinkronizálni is lehet. Vagyis fel lehet tölteni az aktuális verziónkat (push) és le is lehet tölteni más verzióját (pull); mindez a fájlrendszer más pontjáról, virtuális egységről vagy távoli gépről is lehetséges protokollokkal.[20] A GitHub ezeket a tulajdonságokat is magában foglalja, tehát az összes „GI</w:t>
+        <w:t xml:space="preserve">A GitHub alapja egy verziókezelő rendszer, pontosabban a Git. Ez egy nyílt forráskódú verziókezelő szoftver. A feladata, hogy a programozó az addig elért összes verziót tárolja a programjáról, aminek az állapotai elmentésre kerültek. A Git a hangsúlyt a gyorsaságra helyezi, vagyis a parancsok a felhasználó gépén hajtódnak végre. Az adatok </w:t>
+      </w:r>
+      <w:r>
+        <w:lastRenderedPageBreak/>
+        <w:t>elmentésére a tároló egység szolgál. A verziókezelő rendszer egésze abban rejlik, hogy az elmentett állapot egy teljes értékű programot takar. Általa tisztán lehet követni, hogy a módosítások hol és mikor történtek. Ezáltal bármikor vissza lehet térni az előző állapot egyikére, ha a jelenlegi verzió meghibásodna, elveszne akár önhibából vagy külső hatásból. Például egy előző verzió meglévő funkcióit más egyéb irányba ágazó funkciókkal lehet kiegészíteni, de ekkor a felhasználásra kívánt verziót le kell másolni (clone). Emiatt akár egy új ágat (branch) lehet létrehozni a fejlesztés során, ami egy teljesen más irányba visz el az eddigi fejlesztéstől úgy, hogy a kiinduló verziót nem befolyásoljuk a sajátunkkal. A verzió neve az aktuális fejlesztő megadott neve és az aktuális dátumból tevődik össze. A fejlesztés során mindig van egy kiinduló ág, ezt master-nek nevezik - ez a fő ág -, ebből lehetséges új ágakat vagyis branch-eket létrehozni. Csapatmunka során, ha úgy adódik az is lényeges, hogy más is tudja használni az általunk megírt kódot, vagyis ne csak lokálisan létezzen. A Git által a tárolókat (repository) szinkronizálni is lehet. Vagyis fel lehet tölteni az aktuális verziónkat (push) és le is lehet tölteni más verzióját (pull); mindez a fájlrendszer más pontjáról, virtuális egységről vagy távoli gépről is lehetséges protokollokkal.[20] A GitHub ezeket a tulajdonságokat is magában foglalja, tehát az összes „GI</w:t>
       </w:r>
       <w:r>
         <w:t>T” parancsot lehet használni.</w:t>
@@ -5212,77 +5235,51 @@
       <w:pPr>
         <w:pStyle w:val="Kpalrs"/>
       </w:pPr>
+      <w:fldSimple w:instr=" STYLEREF 3 \s ">
+        <w:r>
+          <w:rPr>
+            <w:noProof/>
+          </w:rPr>
+          <w:t>2.7.1</w:t>
+        </w:r>
+      </w:fldSimple>
+      <w:r>
+        <w:noBreakHyphen/>
+      </w:r>
+      <w:fldSimple w:instr=" SEQ ábra \* ARABIC \s 3 ">
+        <w:r>
+          <w:rPr>
+            <w:noProof/>
+          </w:rPr>
+          <w:t>1</w:t>
+        </w:r>
+      </w:fldSimple>
+      <w:r>
+        <w:t>. ábra GitHub munkafolyamat</w:t>
+      </w:r>
       <w:r>
         <w:fldChar w:fldCharType="begin"/>
       </w:r>
       <w:r>
-        <w:instrText xml:space="preserve"> STYLEREF 3 \s </w:instrText>
+        <w:instrText xml:space="preserve"> REF _Ref209359631 \r \h </w:instrText>
       </w:r>
       <w:r>
         <w:fldChar w:fldCharType="separate"/>
       </w:r>
       <w:r>
-        <w:rPr>
-          <w:noProof/>
-        </w:rPr>
-        <w:t>2.7.1</w:t>
-      </w:r>
-      <w:r>
-        <w:rPr>
-          <w:noProof/>
-        </w:rPr>
+        <w:t>[1]</w:t>
+      </w:r>
+      <w:r>
         <w:fldChar w:fldCharType="end"/>
       </w:r>
-      <w:r>
-        <w:noBreakHyphen/>
-      </w:r>
-      <w:r>
-        <w:fldChar w:fldCharType="begin"/>
-      </w:r>
-      <w:r>
-        <w:instrText xml:space="preserve"> SEQ ábra \* ARABIC \s 3 </w:instrText>
-      </w:r>
-      <w:r>
-        <w:fldChar w:fldCharType="separate"/>
-      </w:r>
-      <w:r>
-        <w:rPr>
-          <w:noProof/>
-        </w:rPr>
-        <w:t>1</w:t>
-      </w:r>
-      <w:r>
-        <w:rPr>
-          <w:noProof/>
-        </w:rPr>
-        <w:fldChar w:fldCharType="end"/>
-      </w:r>
-      <w:r>
-        <w:t>. ábra GitHub munkafolyamat</w:t>
-      </w:r>
-      <w:r>
-        <w:fldChar w:fldCharType="begin"/>
-      </w:r>
-      <w:r>
-        <w:instrText xml:space="preserve"> REF _Ref209359631 \r \h </w:instrText>
-      </w:r>
-      <w:r>
-        <w:fldChar w:fldCharType="separate"/>
-      </w:r>
-      <w:r>
-        <w:t>[1]</w:t>
-      </w:r>
-      <w:r>
-        <w:fldChar w:fldCharType="end"/>
-      </w:r>
     </w:p>
     <w:p>
       <w:pPr>
         <w:pStyle w:val="Cmsor1"/>
       </w:pPr>
       <w:bookmarkStart w:id="30" w:name="_Toc209525225"/>
-      <w:bookmarkEnd w:id="7"/>
-      <w:r>
+      <w:r>
+        <w:lastRenderedPageBreak/>
         <w:t>Követelmény- és problématér elemzés</w:t>
       </w:r>
       <w:bookmarkEnd w:id="30"/>
@@ -5428,6 +5425,7 @@
         <w:pStyle w:val="Cmsor1"/>
       </w:pPr>
       <w:r>
+        <w:lastRenderedPageBreak/>
         <w:t xml:space="preserve"> </w:t>
       </w:r>
       <w:bookmarkStart w:id="35" w:name="_Toc209525230"/>
@@ -5444,7 +5442,11 @@
     </w:p>
     <w:p>
       <w:r>
-        <w:t>Architektúra A rendszer egy klasszikus háromrétegű architektúrát követ, amelyben az egyes rétegek elkülönülnek egymástól a felelősségük és funkciójuk szerint. Ez a felépítés elősegíti a kód újrafelhasználhatóságát, karbantarthatóságát és skálázhatóságát. 1.3.1.1 Prezentációs réteg (Angular frontend) Ez a réteg felel a felhasználói interakciók kezeléséért, a grafikus felhasználói felület (GUI) megjelenítéséért és a REST API hívások végrehajtásáért. Az Angular komponensek sablonokat és formokat használnak az adatok megjelenítésére és a felhasználói bemenetek rögzítésére. A kliensoldalon NSwag által generált TypeScript service osztályokat használunk az API-k hívásához, amelyek DTO-kon keresztül kommunikálnak a backenddel. A felület reszponzív, így különböző képernyőméretekhez igazodik, az Angular Material és Bootstrap segítségével modern, letisztult megjelenést biztosít. A komponensalapú fejlesztés lehetővé teszi a moduláris bővíthetőséget, új funkciók könnyű integrálását. 9 1.3.1.2 Alkalmazási logika (ASP.NET Core Web API) A középső rétegben találhatóak a Web API kontrollerek, amelyek kizárólag DTO-kkal dolgoznak, így elszigetelik az entitásokat a külső kommunikációtól. A kontrollerek fogadják az Angular frontend kéréseit, és delegálják azokat a service osztályoknak, ahol a tényleges üzleti logika végrehajtása történik. A service osztályok kezelik az adatok érvényesítését, számításokat (pl. napi tápértékek újrakalkulálása), a DbContext-tel való kapcsolatot, valamint hibaesetek kezelését. Az üzleti logika különválasztása lehetővé teszi az egységtesztelést és a funkciók skálázhatóságát. A hitelesítéshez ASP.NET Identity keretrendszert használunk, amely JWT tokenekkel biztosítja a stateless autentikációt. Az e-mail értesítéseket (pl. regisztráció megerősítése, jelszó-visszaállítás) a Mailjet API kezeli. 1.3.1.3 Adatelérési réteg (Entity Framework Core) Az adatelérési réteg az Entity Framework Core ORM segítségével kommunikál az MSSQL adatbázissal. A DbContext az alkalmazás adatbázisának leképezését biztosítja, és elvégzi a CRUD (Create, Read, Update, Delete) műveleteket az entitásokon keresztül. A lekérdezések LINQ nyelven történnek, lehetőséget biztosítva szűrésre, rendezésre, kapcsolatok beemelésére (Include) és aggregált műveletekre. A migrációs rendszer segítségével a modellváltozások automatikusan leképezhetők az adatbázis-struktúrára. Az entitások között idegen kulcsok és navigációs property-k biztosítják a relációkat, az adatkonzisztencia pedig validációs attribútumokkal és üzleti szabályokkal van biztosítva a service rétegben.</w:t>
+        <w:t xml:space="preserve">Architektúra A rendszer egy klasszikus háromrétegű architektúrát követ, amelyben az egyes rétegek elkülönülnek egymástól a felelősségük és funkciójuk szerint. Ez a felépítés elősegíti a kód újrafelhasználhatóságát, karbantarthatóságát és skálázhatóságát. 1.3.1.1 Prezentációs réteg (Angular frontend) Ez a réteg felel a felhasználói interakciók kezeléséért, a grafikus felhasználói felület (GUI) megjelenítéséért és a REST API hívások végrehajtásáért. Az Angular komponensek sablonokat és formokat használnak az adatok megjelenítésére és a felhasználói bemenetek rögzítésére. A kliensoldalon NSwag által generált TypeScript service osztályokat használunk az API-k hívásához, amelyek DTO-kon keresztül kommunikálnak a backenddel. A felület reszponzív, így különböző képernyőméretekhez igazodik, az Angular Material és Bootstrap segítségével modern, letisztult megjelenést biztosít. A komponensalapú fejlesztés lehetővé teszi a moduláris bővíthetőséget, új funkciók könnyű integrálását. 9 1.3.1.2 Alkalmazási logika (ASP.NET Core Web API) A középső rétegben találhatóak a Web API kontrollerek, amelyek kizárólag DTO-kkal dolgoznak, így elszigetelik az entitásokat a külső kommunikációtól. A kontrollerek fogadják az Angular frontend kéréseit, és delegálják azokat a service osztályoknak, ahol a tényleges üzleti logika végrehajtása történik. A service osztályok kezelik az adatok érvényesítését, számításokat (pl. napi tápértékek újrakalkulálása), a DbContext-tel való kapcsolatot, valamint hibaesetek kezelését. Az üzleti logika különválasztása lehetővé teszi az egységtesztelést és a funkciók skálázhatóságát. A hitelesítéshez ASP.NET Identity keretrendszert használunk, amely JWT tokenekkel biztosítja a stateless autentikációt. Az e-mail értesítéseket (pl. regisztráció megerősítése, jelszó-visszaállítás) a Mailjet API kezeli. 1.3.1.3 Adatelérési réteg (Entity Framework Core) Az adatelérési réteg az Entity Framework Core ORM segítségével kommunikál az MSSQL adatbázissal. A DbContext az alkalmazás adatbázisának leképezését biztosítja, és elvégzi a CRUD (Create, Read, Update, Delete) műveleteket az entitásokon keresztül. A lekérdezések LINQ nyelven történnek, lehetőséget biztosítva szűrésre, rendezésre, kapcsolatok beemelésére (Include) és aggregált műveletekre. A migrációs rendszer segítségével a modellváltozások automatikusan leképezhetők az adatbázis-struktúrára. Az entitások között idegen kulcsok </w:t>
+      </w:r>
+      <w:r>
+        <w:lastRenderedPageBreak/>
+        <w:t>és navigációs property-k biztosítják a relációkat, az adatkonzisztencia pedig validációs attribútumokkal és üzleti szabályokkal van biztosítva a service rétegben.</w:t>
       </w:r>
     </w:p>
     <w:p>
@@ -5453,6 +5455,7 @@
       </w:pPr>
       <w:bookmarkStart w:id="36" w:name="_Toc209525231"/>
       <w:r>
+        <w:lastRenderedPageBreak/>
         <w:t>Adatmodell és API-k (ERD, entitások, DTO-k, végpontok, validációk)</w:t>
       </w:r>
       <w:bookmarkEnd w:id="36"/>
@@ -5522,6 +5525,7 @@
       </w:pPr>
       <w:bookmarkStart w:id="37" w:name="_Toc209525232"/>
       <w:r>
+        <w:lastRenderedPageBreak/>
         <w:t>Frontend megvalósítás (űrlapok, űrlap-validáció, állapotkezelés, navigáció)</w:t>
       </w:r>
       <w:bookmarkEnd w:id="37"/>
@@ -5532,6 +5536,7 @@
       </w:pPr>
       <w:bookmarkStart w:id="38" w:name="_Toc209525233"/>
       <w:r>
+        <w:lastRenderedPageBreak/>
         <w:t>Backend megvalósítás (rétegek, szolgáltatások, tranzakciók, háttérfeladatok)</w:t>
       </w:r>
       <w:bookmarkEnd w:id="38"/>
@@ -5542,6 +5547,7 @@
       </w:pPr>
       <w:bookmarkStart w:id="39" w:name="_Toc209525234"/>
       <w:r>
+        <w:lastRenderedPageBreak/>
         <w:t>Továbbfejlesztési irányok (ajánlórendszer, adatvizualizáció, mobil, többnyelvűség)</w:t>
       </w:r>
       <w:bookmarkEnd w:id="39"/>
@@ -5555,6 +5561,7 @@
       </w:pPr>
       <w:bookmarkStart w:id="40" w:name="_Toc209525235"/>
       <w:r>
+        <w:lastRenderedPageBreak/>
         <w:t>Következtetések és értékelés</w:t>
       </w:r>
       <w:bookmarkEnd w:id="40"/>
@@ -5567,6 +5574,7 @@
       <w:bookmarkStart w:id="41" w:name="_Toc332797403"/>
       <w:bookmarkStart w:id="42" w:name="_Toc209525236"/>
       <w:r>
+        <w:lastRenderedPageBreak/>
         <w:t>Utolsó simítások</w:t>
       </w:r>
       <w:bookmarkEnd w:id="41"/>
@@ -5635,6 +5643,7 @@
       </w:pPr>
       <w:bookmarkStart w:id="43" w:name="_Toc209525237"/>
       <w:r>
+        <w:lastRenderedPageBreak/>
         <w:t>Irodalomjegyzék</w:t>
       </w:r>
       <w:bookmarkEnd w:id="43"/>
@@ -5682,7 +5691,19 @@
           <w:rPr>
             <w:rStyle w:val="Hiperhivatkozs"/>
           </w:rPr>
-          <w:t>https://learn.microsoft.com/hu-hu/aspnet/core/overview?view=aspnetcore-9.0</w:t>
+          <w:t>https</w:t>
+        </w:r>
+        <w:r>
+          <w:rPr>
+            <w:rStyle w:val="Hiperhivatkozs"/>
+          </w:rPr>
+          <w:t>:</w:t>
+        </w:r>
+        <w:r>
+          <w:rPr>
+            <w:rStyle w:val="Hiperhivatkozs"/>
+          </w:rPr>
+          <w:t>//learn.microsoft.com/hu-hu/aspnet/core/overview?view=aspnetcore-9.0</w:t>
         </w:r>
       </w:hyperlink>
       <w:r>
@@ -5754,7 +5775,19 @@
           <w:rPr>
             <w:rStyle w:val="Hiperhivatkozs"/>
           </w:rPr>
-          <w:t>https://dev.mailjet.com/email/guides/</w:t>
+          <w:t>https://</w:t>
+        </w:r>
+        <w:r>
+          <w:rPr>
+            <w:rStyle w:val="Hiperhivatkozs"/>
+          </w:rPr>
+          <w:t>d</w:t>
+        </w:r>
+        <w:r>
+          <w:rPr>
+            <w:rStyle w:val="Hiperhivatkozs"/>
+          </w:rPr>
+          <w:t>ev.mailjet.com/email/guides/</w:t>
         </w:r>
       </w:hyperlink>
       <w:r>
@@ -5787,7 +5820,19 @@
           <w:rPr>
             <w:rStyle w:val="Hiperhivatkozs"/>
           </w:rPr>
-          <w:t>https://www.nuget.org/packages/Microsoft.AspNetCore.Authentication.JwtBearer</w:t>
+          <w:t>https://www.nuget.org/packages/Microsoft.Asp</w:t>
+        </w:r>
+        <w:r>
+          <w:rPr>
+            <w:rStyle w:val="Hiperhivatkozs"/>
+          </w:rPr>
+          <w:t>N</w:t>
+        </w:r>
+        <w:r>
+          <w:rPr>
+            <w:rStyle w:val="Hiperhivatkozs"/>
+          </w:rPr>
+          <w:t>etCore.Authentication.JwtBearer</w:t>
         </w:r>
       </w:hyperlink>
       <w:r>
@@ -5821,41 +5866,21 @@
             <w:rStyle w:val="Hiperhivatkozs"/>
             <w:i/>
           </w:rPr>
-          <w:t>https://github.com/RicoSuter/NSwag?tab=readme-ov-file</w:t>
-        </w:r>
-      </w:hyperlink>
-      <w:r>
-        <w:rPr>
-          <w:i/>
-        </w:rPr>
-        <w:t xml:space="preserve"> </w:t>
-      </w:r>
-      <w:r>
-        <w:t>[Hozzáférés dátuma: 21 09 2025].</w:t>
-      </w:r>
-      <w:bookmarkEnd w:id="49"/>
-    </w:p>
-    <w:p>
-      <w:pPr>
-        <w:pStyle w:val="Irodalomjegyzksor"/>
-        <w:rPr>
-          <w:i/>
-        </w:rPr>
-      </w:pPr>
-      <w:bookmarkStart w:id="50" w:name="_Ref209365059"/>
-      <w:r>
-        <w:rPr>
-          <w:i/>
-        </w:rPr>
-        <w:t xml:space="preserve">Entity Framewrok Available: </w:t>
-      </w:r>
-      <w:hyperlink r:id="rId18" w:history="1">
+          <w:t>https://github</w:t>
+        </w:r>
         <w:r>
           <w:rPr>
             <w:rStyle w:val="Hiperhivatkozs"/>
             <w:i/>
           </w:rPr>
-          <w:t>https://learn.microsoft.com/hu-hu/ef/</w:t>
+          <w:t>.</w:t>
+        </w:r>
+        <w:r>
+          <w:rPr>
+            <w:rStyle w:val="Hiperhivatkozs"/>
+            <w:i/>
+          </w:rPr>
+          <w:t>com/RicoSuter/NSwag?tab=readme-ov-file</w:t>
         </w:r>
       </w:hyperlink>
       <w:r>
@@ -5867,6 +5892,54 @@
       <w:r>
         <w:t>[Hozzáférés dátuma: 21 09 2025].</w:t>
       </w:r>
+      <w:bookmarkEnd w:id="49"/>
+    </w:p>
+    <w:p>
+      <w:pPr>
+        <w:pStyle w:val="Irodalomjegyzksor"/>
+        <w:rPr>
+          <w:i/>
+        </w:rPr>
+      </w:pPr>
+      <w:bookmarkStart w:id="50" w:name="_Ref209365059"/>
+      <w:r>
+        <w:rPr>
+          <w:i/>
+        </w:rPr>
+        <w:t xml:space="preserve">Entity Framewrok Available: </w:t>
+      </w:r>
+      <w:hyperlink r:id="rId18" w:history="1">
+        <w:r>
+          <w:rPr>
+            <w:rStyle w:val="Hiperhivatkozs"/>
+            <w:i/>
+          </w:rPr>
+          <w:t>http</w:t>
+        </w:r>
+        <w:r>
+          <w:rPr>
+            <w:rStyle w:val="Hiperhivatkozs"/>
+            <w:i/>
+          </w:rPr>
+          <w:t>s</w:t>
+        </w:r>
+        <w:r>
+          <w:rPr>
+            <w:rStyle w:val="Hiperhivatkozs"/>
+            <w:i/>
+          </w:rPr>
+          <w:t>://learn.microsoft.com/hu-hu/ef/</w:t>
+        </w:r>
+      </w:hyperlink>
+      <w:r>
+        <w:rPr>
+          <w:i/>
+        </w:rPr>
+        <w:t xml:space="preserve"> </w:t>
+      </w:r>
+      <w:r>
+        <w:t>[Hozzáférés dátuma: 21 09 2025].</w:t>
+      </w:r>
       <w:bookmarkEnd w:id="50"/>
     </w:p>
     <w:p>
@@ -5888,7 +5961,19 @@
           <w:rPr>
             <w:rStyle w:val="Hiperhivatkozs"/>
           </w:rPr>
-          <w:t>https://v17.angular.io/guide/what-is-angular</w:t>
+          <w:t>https://v</w:t>
+        </w:r>
+        <w:r>
+          <w:rPr>
+            <w:rStyle w:val="Hiperhivatkozs"/>
+          </w:rPr>
+          <w:t>1</w:t>
+        </w:r>
+        <w:r>
+          <w:rPr>
+            <w:rStyle w:val="Hiperhivatkozs"/>
+          </w:rPr>
+          <w:t>7.angular.io/guide/what-is-angular</w:t>
         </w:r>
       </w:hyperlink>
       <w:r>
@@ -5927,7 +6012,19 @@
           <w:rPr>
             <w:rStyle w:val="Hiperhivatkozs"/>
           </w:rPr>
-          <w:t>https://www.typescriptlang.org/why-create-typescript/</w:t>
+          <w:t>https:</w:t>
+        </w:r>
+        <w:r>
+          <w:rPr>
+            <w:rStyle w:val="Hiperhivatkozs"/>
+          </w:rPr>
+          <w:t>/</w:t>
+        </w:r>
+        <w:r>
+          <w:rPr>
+            <w:rStyle w:val="Hiperhivatkozs"/>
+          </w:rPr>
+          <w:t>/www.typescriptlang.org/why-create-typescript/</w:t>
         </w:r>
       </w:hyperlink>
       <w:r>
@@ -5959,7 +6056,19 @@
           <w:rPr>
             <w:rStyle w:val="Hiperhivatkozs"/>
           </w:rPr>
-          <w:t>https://visualstudio.microsoft.com/</w:t>
+          <w:t>https</w:t>
+        </w:r>
+        <w:r>
+          <w:rPr>
+            <w:rStyle w:val="Hiperhivatkozs"/>
+          </w:rPr>
+          <w:t>:</w:t>
+        </w:r>
+        <w:r>
+          <w:rPr>
+            <w:rStyle w:val="Hiperhivatkozs"/>
+          </w:rPr>
+          <w:t>//visualstudio.microsoft.com/</w:t>
         </w:r>
       </w:hyperlink>
       <w:r>
@@ -5990,7 +6099,19 @@
           <w:rPr>
             <w:rStyle w:val="Hiperhivatkozs"/>
           </w:rPr>
-          <w:t>https://swagger.io/resources/open-api/</w:t>
+          <w:t>https://swagger.io/re</w:t>
+        </w:r>
+        <w:r>
+          <w:rPr>
+            <w:rStyle w:val="Hiperhivatkozs"/>
+          </w:rPr>
+          <w:t>s</w:t>
+        </w:r>
+        <w:r>
+          <w:rPr>
+            <w:rStyle w:val="Hiperhivatkozs"/>
+          </w:rPr>
+          <w:t>ources/open-api/</w:t>
         </w:r>
       </w:hyperlink>
       <w:r>
@@ -6030,6 +6151,7 @@
       </w:pPr>
       <w:bookmarkStart w:id="53" w:name="_Toc209525238"/>
       <w:r>
+        <w:lastRenderedPageBreak/>
         <w:t>Függelék</w:t>
       </w:r>
       <w:bookmarkEnd w:id="53"/>
@@ -6123,7 +6245,7 @@
         <w:rStyle w:val="Oldalszm"/>
         <w:noProof/>
       </w:rPr>
-      <w:t>20</w:t>
+      <w:t>22</w:t>
     </w:r>
     <w:r>
       <w:rPr>
@@ -9536,6 +9658,15 @@
       <w:szCs w:val="16"/>
     </w:rPr>
   </w:style>
+  <w:style w:type="character" w:styleId="Mrltotthiperhivatkozs">
+    <w:name w:val="FollowedHyperlink"/>
+    <w:basedOn w:val="Bekezdsalapbettpusa"/>
+    <w:rsid w:val="008963C2"/>
+    <w:rPr>
+      <w:color w:val="954F72" w:themeColor="followedHyperlink"/>
+      <w:u w:val="single"/>
+    </w:rPr>
+  </w:style>
 </w:styles>
 </file>
 
@@ -9839,7 +9970,7 @@
 </file>
 
 <file path=customXml/itemProps1.xml><?xml version="1.0" encoding="utf-8"?>
-<ds:datastoreItem xmlns:ds="http://schemas.openxmlformats.org/officeDocument/2006/customXml" ds:itemID="{CEFECCCB-53DD-4325-B1C6-07F8B4AE94B8}">
+<ds:datastoreItem xmlns:ds="http://schemas.openxmlformats.org/officeDocument/2006/customXml" ds:itemID="{C00B1EED-8880-4B2A-94CB-3C40625EF35F}">
   <ds:schemaRefs>
     <ds:schemaRef ds:uri="http://schemas.openxmlformats.org/officeDocument/2006/bibliography"/>
   </ds:schemaRefs>

</xml_diff>